<commit_message>
refine(resume): crisp 1-page — vision-led summary, tighter experience, scannable
</commit_message>
<xml_diff>
--- a/public/resume/chirag-singhal-resume.docx
+++ b/public/resume/chirag-singhal-resume.docx
@@ -11,7 +11,7 @@
         <w:rPr>
           <w:b/>
           <w:color w:val="14532D"/>
-          <w:sz w:val="40"/>
+          <w:sz w:val="42"/>
         </w:rPr>
         <w:t>Chirag Singhal</w:t>
       </w:r>
@@ -24,9 +24,9 @@
       <w:r>
         <w:rPr>
           <w:b/>
-          <w:sz w:val="19"/>
+          <w:sz w:val="20"/>
         </w:rPr>
-        <w:t>Software Engineer · SAP CPQ / Lead-to-Cash · Backend &amp; Applied AI</w:t>
+        <w:t>Software Engineer — SAP CPQ / Lead-to-Cash · Backend &amp; Applied AI</w:t>
       </w:r>
     </w:p>
     <w:p>
@@ -38,12 +38,12 @@
         <w:rPr>
           <w:sz w:val="18"/>
         </w:rPr>
-        <w:t>Ghaziabad, Uttar Pradesh, India | +91 74284-49707 | chirag@oriz.in | oriz.in | github.com/chirag127 | linkedin.com/in/chirag127</w:t>
+        <w:t>Ghaziabad, India | +91 74284-49707 | chirag@oriz.in | github.com/chirag127 | linkedin.com/in/chirag127 | oriz.in</w:t>
       </w:r>
     </w:p>
     <w:p>
       <w:pPr>
-        <w:spacing w:after="40" w:before="120"/>
+        <w:spacing w:after="60" w:before="160"/>
         <w:pBdr>
           <w:bottom w:val="single" w:sz="6" w:space="1" w:color="14532d"/>
         </w:pBdr>
@@ -65,12 +65,12 @@
         <w:rPr>
           <w:sz w:val="19"/>
         </w:rPr>
-        <w:t>Software Engineer on the SAP CPQ (Configure-Price-Quote) Lead-to-Cash platform at TCS, supporting the quote-to-order lifecycle across 20+ functional areas and building internal tooling to accelerate it. Open-source builder — Model Context Protocol (MCP) servers, browser extensions, and the free oriz.in tools family. JEE Advanced 2020 AIR 11870; college topper (CGPA 8.81).</w:t>
+        <w:t>Backend and applied-AI engineer who ships tools people actually use. At TCS I keep SAP's Lead-to-Cash quoting engine running and build AI systems that make the work faster; outside it I run oriz.in — a growing family of free web tools and open-source MCP servers. I want to build products at the intersection of solid backend engineering and practical AI. JEE Advanced 2020 AIR 11870 · college topper (CGPA 8.81).</w:t>
       </w:r>
     </w:p>
     <w:p>
       <w:pPr>
-        <w:spacing w:after="40" w:before="120"/>
+        <w:spacing w:after="60" w:before="160"/>
         <w:pBdr>
           <w:bottom w:val="single" w:sz="6" w:space="1" w:color="14532d"/>
         </w:pBdr>
@@ -87,7 +87,7 @@
     <w:p>
       <w:pPr>
         <w:tabs>
-          <w:tab w:pos="10080" w:val="right"/>
+          <w:tab w:pos="9936" w:val="right"/>
         </w:tabs>
         <w:spacing w:after="20" w:before="0"/>
       </w:pPr>
@@ -104,52 +104,52 @@
           <w:sz w:val="18"/>
         </w:rPr>
         <w:tab/>
-        <w:t>Bhubaneswar, India · Jun 2025 – Present</w:t>
+        <w:t>Bhubaneswar · Jun 2025 – Present</w:t>
       </w:r>
     </w:p>
     <w:p>
       <w:pPr>
         <w:pStyle w:val="ListBullet"/>
-        <w:spacing w:after="20"/>
+        <w:spacing w:after="40"/>
         <w:ind w:left="288"/>
       </w:pPr>
       <w:r>
         <w:rPr>
           <w:sz w:val="19"/>
         </w:rPr>
-        <w:t>Support the SAP CPQ Lead-to-Cash platform across 20+ functional areas — Bill of Materials &amp; Pricing, Opportunity Management, Quote Info &amp; Terms, Deal Reviews &amp; Approvals, Provisioning, Contracting, OBV, and Public Cloud Order Management.</w:t>
+        <w:t>Support SAP CPQ Lead-to-Cash across 20+ areas (Bill of Materials &amp; Pricing, Quote Terms, Deal Reviews, Provisioning, Contracting, OBV).</w:t>
       </w:r>
     </w:p>
     <w:p>
       <w:pPr>
         <w:pStyle w:val="ListBullet"/>
-        <w:spacing w:after="20"/>
+        <w:spacing w:after="40"/>
         <w:ind w:left="288"/>
       </w:pPr>
       <w:r>
         <w:rPr>
           <w:sz w:val="19"/>
         </w:rPr>
-        <w:t>Built a hybrid-RAG search and documentation system over the CPQ onboarding knowledge base (100+ videos, 40+ decks) to speed ticket resolution and onboarding; currently completing the Cloud Quote KT.</w:t>
+        <w:t>Built a hybrid-RAG search over the onboarding knowledge base (100+ videos, 40+ decks) that cuts ticket-resolution time.</w:t>
       </w:r>
     </w:p>
     <w:p>
       <w:pPr>
         <w:pStyle w:val="ListBullet"/>
-        <w:spacing w:after="20"/>
+        <w:spacing w:after="40"/>
         <w:ind w:left="288"/>
       </w:pPr>
       <w:r>
         <w:rPr>
           <w:sz w:val="19"/>
         </w:rPr>
-        <w:t>Automate pricing/configuration validation and CI/CD workflows in Python; build React dashboards for backend configuration visibility.</w:t>
+        <w:t>Automate pricing/config validation and CI/CD in Python; build React dashboards for config visibility.</w:t>
       </w:r>
     </w:p>
     <w:p>
       <w:pPr>
         <w:tabs>
-          <w:tab w:pos="10080" w:val="right"/>
+          <w:tab w:pos="9936" w:val="right"/>
         </w:tabs>
         <w:spacing w:after="20" w:before="0"/>
       </w:pPr>
@@ -158,7 +158,7 @@
           <w:b/>
           <w:sz w:val="20"/>
         </w:rPr>
-        <w:t>Software Developer — Full Stack — QRsay.com</w:t>
+        <w:t>Full-Stack Developer — QRsay.com</w:t>
       </w:r>
       <w:r>
         <w:rPr>
@@ -172,32 +172,32 @@
     <w:p>
       <w:pPr>
         <w:pStyle w:val="ListBullet"/>
-        <w:spacing w:after="20"/>
+        <w:spacing w:after="40"/>
         <w:ind w:left="288"/>
       </w:pPr>
       <w:r>
         <w:rPr>
           <w:sz w:val="19"/>
         </w:rPr>
-        <w:t>Built and maintained a food-commerce platform (Python / Node.js / MongoDB).</w:t>
+        <w:t>Built a food-commerce platform (Python / Node.js / MongoDB) with a Kafka order pipeline and Razorpay payments.</w:t>
       </w:r>
     </w:p>
     <w:p>
       <w:pPr>
         <w:pStyle w:val="ListBullet"/>
-        <w:spacing w:after="20"/>
+        <w:spacing w:after="40"/>
         <w:ind w:left="288"/>
       </w:pPr>
       <w:r>
         <w:rPr>
           <w:sz w:val="19"/>
         </w:rPr>
-        <w:t>Designed an event-driven order-processing pipeline on Apache Kafka; integrated Razorpay with HMAC-verified webhooks; cut API latency via query tuning and Redis caching.</w:t>
+        <w:t>Cut API latency through query tuning and Redis caching.</w:t>
       </w:r>
     </w:p>
     <w:p>
       <w:pPr>
-        <w:spacing w:after="40" w:before="120"/>
+        <w:spacing w:after="60" w:before="160"/>
         <w:pBdr>
           <w:bottom w:val="single" w:sz="6" w:space="1" w:color="14532d"/>
         </w:pBdr>
@@ -208,64 +208,51 @@
           <w:color w:val="14532D"/>
           <w:sz w:val="22"/>
         </w:rPr>
-        <w:t>OPEN-SOURCE PROJECTS</w:t>
+        <w:t>PROJECTS</w:t>
       </w:r>
     </w:p>
     <w:p>
       <w:pPr>
         <w:pStyle w:val="ListBullet"/>
-        <w:spacing w:after="20"/>
+        <w:spacing w:after="40"/>
         <w:ind w:left="288"/>
       </w:pPr>
       <w:r>
         <w:rPr>
           <w:sz w:val="19"/>
         </w:rPr>
-        <w:t>oriz.in (flagship) — a privacy-first family of client-side web tools + live-data APIs; compute runs in-browser or on Cloudflare Workers. Publishes reusable @chirag127/* npm packages. — oriz.in</w:t>
+        <w:t>oriz.in — free client-side web tools &amp; live-data APIs; runs in-browser / on Cloudflare Workers. Publishes @chirag127/* npm packages.</w:t>
       </w:r>
     </w:p>
     <w:p>
       <w:pPr>
         <w:pStyle w:val="ListBullet"/>
-        <w:spacing w:after="20"/>
+        <w:spacing w:after="40"/>
         <w:ind w:left="288"/>
       </w:pPr>
       <w:r>
         <w:rPr>
           <w:sz w:val="19"/>
         </w:rPr>
-        <w:t>Clear-Thought MCP Server (36 stars, TypeScript) — Model Context Protocol server exposing 16 structured-thinking tools; zero runtime deps beyond the MCP SDK. — github.com/chirag127/Clear-Thought-MCP-server</w:t>
+        <w:t>Clear-Thought MCP Server (36 stars) — MCP server giving AI agents 16 structured-thinking tools; zero runtime deps.</w:t>
       </w:r>
     </w:p>
     <w:p>
       <w:pPr>
         <w:pStyle w:val="ListBullet"/>
-        <w:spacing w:after="20"/>
+        <w:spacing w:after="40"/>
         <w:ind w:left="288"/>
       </w:pPr>
       <w:r>
         <w:rPr>
           <w:sz w:val="19"/>
         </w:rPr>
-        <w:t>bookmark-mind (10 stars, JavaScript) — Chrome extension that auto-categorises bookmarks via a local LLM call; no cloud round-trip. — github.com/chirag127/bookmark-mind</w:t>
+        <w:t>bookmark-mind (10 stars) — Chrome extension that auto-sorts bookmarks with a local LLM, no cloud round-trip.</w:t>
       </w:r>
     </w:p>
     <w:p>
       <w:pPr>
-        <w:pStyle w:val="ListBullet"/>
-        <w:spacing w:after="20"/>
-        <w:ind w:left="288"/>
-      </w:pPr>
-      <w:r>
-        <w:rPr>
-          <w:sz w:val="19"/>
-        </w:rPr>
-        <w:t>Also: Stochastic-Thinking MCP · YouTube AI Navigator · OmniDistribute · olivia · sponsorblock-ai — github.com/chirag127</w:t>
-      </w:r>
-    </w:p>
-    <w:p>
-      <w:pPr>
-        <w:spacing w:after="40" w:before="120"/>
+        <w:spacing w:after="60" w:before="160"/>
         <w:pBdr>
           <w:bottom w:val="single" w:sz="6" w:space="1" w:color="14532d"/>
         </w:pBdr>
@@ -288,13 +275,13 @@
           <w:b/>
           <w:sz w:val="19"/>
         </w:rPr>
-        <w:t xml:space="preserve">Languages: </w:t>
+        <w:t xml:space="preserve">Backend &amp; AI: </w:t>
       </w:r>
       <w:r>
         <w:rPr>
           <w:sz w:val="19"/>
         </w:rPr>
-        <w:t>TypeScript, Python, JavaScript, SQL, Bash</w:t>
+        <w:t>Python, Node.js, FastAPI, REST APIs, MCP servers, RAG, multi-provider LLMs (Gemini/Groq/Mistral)</w:t>
       </w:r>
     </w:p>
     <w:p>
@@ -312,43 +299,7 @@
         <w:rPr>
           <w:sz w:val="19"/>
         </w:rPr>
-        <w:t>React, Astro, Tailwind CSS, browser extensions (Chrome/Firefox)</w:t>
-      </w:r>
-    </w:p>
-    <w:p>
-      <w:pPr>
-        <w:spacing w:after="20" w:before="0"/>
-      </w:pPr>
-      <w:r>
-        <w:rPr>
-          <w:b/>
-          <w:sz w:val="19"/>
-        </w:rPr>
-        <w:t xml:space="preserve">Backend: </w:t>
-      </w:r>
-      <w:r>
-        <w:rPr>
-          <w:sz w:val="19"/>
-        </w:rPr>
-        <w:t>Node.js, FastAPI, Flask, Express.js, REST APIs</w:t>
-      </w:r>
-    </w:p>
-    <w:p>
-      <w:pPr>
-        <w:spacing w:after="20" w:before="0"/>
-      </w:pPr>
-      <w:r>
-        <w:rPr>
-          <w:b/>
-          <w:sz w:val="19"/>
-        </w:rPr>
-        <w:t xml:space="preserve">AI / LLM: </w:t>
-      </w:r>
-      <w:r>
-        <w:rPr>
-          <w:sz w:val="19"/>
-        </w:rPr>
-        <w:t>MCP server development, multi-provider LLM integration (Gemini, Groq, Mistral, NVIDIA NIM), RAG pipelines, web scraping (Playwright / httpx / BeautifulSoup)</w:t>
+        <w:t>TypeScript, React, Astro, Tailwind CSS</w:t>
       </w:r>
     </w:p>
     <w:p>
@@ -366,12 +317,12 @@
         <w:rPr>
           <w:sz w:val="19"/>
         </w:rPr>
-        <w:t>PostgreSQL (Neon / Supabase), Turso, Redis, MongoDB, Cloudflare Workers &amp; Pages, Firebase, Docker, GitHub Actions CI/CD</w:t>
+        <w:t>PostgreSQL, Redis, MongoDB, Cloudflare Workers, Docker, GitHub Actions CI/CD</w:t>
       </w:r>
     </w:p>
     <w:p>
       <w:pPr>
-        <w:spacing w:after="40" w:before="120"/>
+        <w:spacing w:after="60" w:before="160"/>
         <w:pBdr>
           <w:bottom w:val="single" w:sz="6" w:space="1" w:color="14532d"/>
         </w:pBdr>
@@ -382,116 +333,38 @@
           <w:color w:val="14532D"/>
           <w:sz w:val="22"/>
         </w:rPr>
-        <w:t>EDUCATION</w:t>
-      </w:r>
-    </w:p>
-    <w:p>
-      <w:pPr>
-        <w:tabs>
-          <w:tab w:pos="10080" w:val="right"/>
-        </w:tabs>
-        <w:spacing w:after="20" w:before="0"/>
-      </w:pPr>
-      <w:r>
-        <w:rPr>
-          <w:b/>
-          <w:sz w:val="20"/>
-        </w:rPr>
-        <w:t>B.Tech, Computer Science &amp; Engineering — AKTU (A.P.J. Abdul Kalam Tech. University)</w:t>
-      </w:r>
-      <w:r>
-        <w:rPr>
-          <w:color w:val="555555"/>
-          <w:sz w:val="18"/>
-        </w:rPr>
-        <w:tab/>
-        <w:t>Uttar Pradesh · 2020 – 2024</w:t>
+        <w:t>EDUCATION &amp; RECOGNITION</w:t>
       </w:r>
     </w:p>
     <w:p>
       <w:pPr>
         <w:pStyle w:val="ListBullet"/>
-        <w:spacing w:after="20"/>
+        <w:spacing w:after="40"/>
         <w:ind w:left="288"/>
       </w:pPr>
       <w:r>
         <w:rPr>
           <w:sz w:val="19"/>
         </w:rPr>
-        <w:t>CGPA 8.81 / 10 — College Topper (Rank 1). Class XII (CBSE) 97%.</w:t>
-      </w:r>
-    </w:p>
-    <w:p>
-      <w:pPr>
-        <w:spacing w:after="40" w:before="120"/>
-        <w:pBdr>
-          <w:bottom w:val="single" w:sz="6" w:space="1" w:color="14532d"/>
-        </w:pBdr>
-      </w:pPr>
-      <w:r>
-        <w:rPr>
-          <w:b/>
-          <w:color w:val="14532D"/>
-          <w:sz w:val="22"/>
-        </w:rPr>
-        <w:t>HONORS &amp; CERTIFICATIONS</w:t>
+        <w:t>B.Tech, Computer Science — AKTU (2020–2024), CGPA 8.81, College Topper · Class XII 97% · JEE Advanced AIR 11870.</w:t>
       </w:r>
     </w:p>
     <w:p>
       <w:pPr>
         <w:pStyle w:val="ListBullet"/>
-        <w:spacing w:after="20"/>
+        <w:spacing w:after="40"/>
         <w:ind w:left="288"/>
       </w:pPr>
       <w:r>
         <w:rPr>
           <w:sz w:val="19"/>
         </w:rPr>
-        <w:t>JEE Advanced 2020 — All India Rank 11870 (top 1%).</w:t>
-      </w:r>
-    </w:p>
-    <w:p>
-      <w:pPr>
-        <w:pStyle w:val="ListBullet"/>
-        <w:spacing w:after="20"/>
-        <w:ind w:left="288"/>
-      </w:pPr>
-      <w:r>
-        <w:rPr>
-          <w:sz w:val="19"/>
-        </w:rPr>
-        <w:t>College Topper — Rank 1, AKTU B.Tech CSE (2020–2024).</w:t>
-      </w:r>
-    </w:p>
-    <w:p>
-      <w:pPr>
-        <w:pStyle w:val="ListBullet"/>
-        <w:spacing w:after="20"/>
-        <w:ind w:left="288"/>
-      </w:pPr>
-      <w:r>
-        <w:rPr>
-          <w:sz w:val="19"/>
-        </w:rPr>
-        <w:t>Claude Certified Associate — Foundations, Anthropic (2026).</w:t>
-      </w:r>
-    </w:p>
-    <w:p>
-      <w:pPr>
-        <w:pStyle w:val="ListBullet"/>
-        <w:spacing w:after="20"/>
-        <w:ind w:left="288"/>
-      </w:pPr>
-      <w:r>
-        <w:rPr>
-          <w:sz w:val="19"/>
-        </w:rPr>
-        <w:t>Professional Development (Udemy Business, TCS): 20+ courses across AI/LLM (Claude Code, MCP, Generative AI), Python, ML for Data Engineers, EU AI Act Compliance, and Agile.</w:t>
+        <w:t>Claude Certified Associate — Foundations (Anthropic, 2026) · 20+ Udemy Business courses (AI/LLM, Python, MLOps).</w:t>
       </w:r>
     </w:p>
     <w:sectPr>
       <w:pgSz w:w="12240" w:h="15840"/>
-      <w:pgMar w:top="720" w:right="864" w:bottom="720" w:left="864" w:header="720" w:footer="720" w:gutter="0"/>
+      <w:pgMar w:top="792" w:right="1008" w:bottom="792" w:left="1008" w:header="720" w:footer="720" w:gutter="0"/>
       <w:cols w:space="720"/>
       <w:docGrid w:linePitch="360"/>
     </w:sectPr>

</xml_diff>

<commit_message>
refine(resume): drop CGPA, split Education/Honors, summary keeps only standout (AIR 11870)
</commit_message>
<xml_diff>
--- a/public/resume/chirag-singhal-resume.docx
+++ b/public/resume/chirag-singhal-resume.docx
@@ -65,7 +65,7 @@
         <w:rPr>
           <w:sz w:val="19"/>
         </w:rPr>
-        <w:t>Software engineer with 3+ years across backend, full-stack, and applied AI — currently on SAP's Lead-to-Cash platform at TCS. Blend of enterprise delivery and builder's range: I ship production systems, run oriz.in (a family of free web tools + open-source MCP servers), and turn AI into tools that cut real work — backed by a JEE Advanced AIR 11870 and college-topper (CGPA 8.81) track record. Vision: build AI-native products that make powerful tools free and effortless for everyone — the way oriz.in already does at small scale.</w:t>
+        <w:t>Software engineer with 3+ years across backend, full-stack, and applied AI — currently on SAP's Lead-to-Cash platform at TCS. Blend of enterprise delivery and builder's range: I ship production systems, run oriz.in (a family of free web tools + open-source MCP servers), and turn AI into tools that cut real work — with a JEE Advanced AIR 11870 (top 1%) pedigree. Vision: build AI-native products that make powerful tools free and effortless for everyone — the way oriz.in already does at small scale.</w:t>
       </w:r>
     </w:p>
     <w:p>
@@ -333,7 +333,30 @@
           <w:color w:val="14532D"/>
           <w:sz w:val="22"/>
         </w:rPr>
-        <w:t>EDUCATION &amp; RECOGNITION</w:t>
+        <w:t>EDUCATION</w:t>
+      </w:r>
+    </w:p>
+    <w:p>
+      <w:pPr>
+        <w:tabs>
+          <w:tab w:pos="9936" w:val="right"/>
+        </w:tabs>
+        <w:spacing w:after="20" w:before="0"/>
+      </w:pPr>
+      <w:r>
+        <w:rPr>
+          <w:b/>
+          <w:sz w:val="20"/>
+        </w:rPr>
+        <w:t>B.Tech, Computer Science &amp; Engineering — AKTU (A.P.J. Abdul Kalam Tech. University)</w:t>
+      </w:r>
+      <w:r>
+        <w:rPr>
+          <w:color w:val="555555"/>
+          <w:sz w:val="18"/>
+        </w:rPr>
+        <w:tab/>
+        <w:t>Uttar Pradesh · 2020 – 2024</w:t>
       </w:r>
     </w:p>
     <w:p>
@@ -346,7 +369,23 @@
         <w:rPr>
           <w:sz w:val="19"/>
         </w:rPr>
-        <w:t>B.Tech, Computer Science — AKTU (2020–2024), CGPA 8.81, College Topper · Class XII 97% · JEE Advanced AIR 11870.</w:t>
+        <w:t>College Topper (Rank 1) · Senior Secondary (CBSE) — 97%.</w:t>
+      </w:r>
+    </w:p>
+    <w:p>
+      <w:pPr>
+        <w:spacing w:after="60" w:before="160"/>
+        <w:pBdr>
+          <w:bottom w:val="single" w:sz="6" w:space="1" w:color="14532d"/>
+        </w:pBdr>
+      </w:pPr>
+      <w:r>
+        <w:rPr>
+          <w:b/>
+          <w:color w:val="14532D"/>
+          <w:sz w:val="22"/>
+        </w:rPr>
+        <w:t>HONORS &amp; RECOGNITION</w:t>
       </w:r>
     </w:p>
     <w:p>
@@ -359,7 +398,33 @@
         <w:rPr>
           <w:sz w:val="19"/>
         </w:rPr>
-        <w:t>Claude Certified Associate — Foundations (Anthropic, 2026) · 20+ Udemy Business courses (AI/LLM, Python, MLOps).</w:t>
+        <w:t>JEE Advanced 2020 — All India Rank 11870 (top 1%).</w:t>
+      </w:r>
+    </w:p>
+    <w:p>
+      <w:pPr>
+        <w:pStyle w:val="ListBullet"/>
+        <w:spacing w:after="40"/>
+        <w:ind w:left="288"/>
+      </w:pPr>
+      <w:r>
+        <w:rPr>
+          <w:sz w:val="19"/>
+        </w:rPr>
+        <w:t>Claude Certified Associate — Foundations, Anthropic (2026).</w:t>
+      </w:r>
+    </w:p>
+    <w:p>
+      <w:pPr>
+        <w:pStyle w:val="ListBullet"/>
+        <w:spacing w:after="40"/>
+        <w:ind w:left="288"/>
+      </w:pPr>
+      <w:r>
+        <w:rPr>
+          <w:sz w:val="19"/>
+        </w:rPr>
+        <w:t>20+ Udemy Business courses (TCS) across AI/LLM, Python, and MLOps.</w:t>
       </w:r>
     </w:p>
     <w:sectPr>

</xml_diff>

<commit_message>
refine(resume): Summary/Experience(+summary line)/Projects/Skills/Qualification sections
</commit_message>
<xml_diff>
--- a/public/resume/chirag-singhal-resume.docx
+++ b/public/resume/chirag-singhal-resume.docx
@@ -82,6 +82,18 @@
           <w:sz w:val="22"/>
         </w:rPr>
         <w:t>EXPERIENCE</w:t>
+      </w:r>
+    </w:p>
+    <w:p>
+      <w:pPr>
+        <w:spacing w:after="60" w:before="0"/>
+      </w:pPr>
+      <w:r>
+        <w:rPr>
+          <w:i/>
+          <w:sz w:val="19"/>
+        </w:rPr>
+        <w:t>3+ years shipping backend, full-stack, and applied-AI systems — from enterprise SAP CPQ at TCS to a self-run family of production web tools.</w:t>
       </w:r>
     </w:p>
     <w:p>
@@ -333,7 +345,7 @@
           <w:color w:val="14532D"/>
           <w:sz w:val="22"/>
         </w:rPr>
-        <w:t>EDUCATION</w:t>
+        <w:t>QUALIFICATION</w:t>
       </w:r>
     </w:p>
     <w:p>
@@ -374,22 +386,6 @@
     </w:p>
     <w:p>
       <w:pPr>
-        <w:spacing w:after="60" w:before="160"/>
-        <w:pBdr>
-          <w:bottom w:val="single" w:sz="6" w:space="1" w:color="14532d"/>
-        </w:pBdr>
-      </w:pPr>
-      <w:r>
-        <w:rPr>
-          <w:b/>
-          <w:color w:val="14532D"/>
-          <w:sz w:val="22"/>
-        </w:rPr>
-        <w:t>HONORS &amp; RECOGNITION</w:t>
-      </w:r>
-    </w:p>
-    <w:p>
-      <w:pPr>
         <w:pStyle w:val="ListBullet"/>
         <w:spacing w:after="40"/>
         <w:ind w:left="288"/>
@@ -411,20 +407,7 @@
         <w:rPr>
           <w:sz w:val="19"/>
         </w:rPr>
-        <w:t>Claude Certified Associate — Foundations, Anthropic (2026).</w:t>
-      </w:r>
-    </w:p>
-    <w:p>
-      <w:pPr>
-        <w:pStyle w:val="ListBullet"/>
-        <w:spacing w:after="40"/>
-        <w:ind w:left="288"/>
-      </w:pPr>
-      <w:r>
-        <w:rPr>
-          <w:sz w:val="19"/>
-        </w:rPr>
-        <w:t>20+ Udemy Business courses (TCS) across AI/LLM, Python, and MLOps.</w:t>
+        <w:t>Claude Certified Associate — Foundations, Anthropic (2026) · 20+ Udemy Business courses (TCS: AI/LLM, Python, MLOps).</w:t>
       </w:r>
     </w:p>
     <w:sectPr>

</xml_diff>

<commit_message>
expand(resume): flowing-paragraph summary + comprehensive 2-page (full skills, all projects)
</commit_message>
<xml_diff>
--- a/public/resume/chirag-singhal-resume.docx
+++ b/public/resume/chirag-singhal-resume.docx
@@ -26,7 +26,7 @@
           <w:b/>
           <w:sz w:val="20"/>
         </w:rPr>
-        <w:t>Software Engineer — SAP CPQ / Lead-to-Cash · Backend &amp; Applied AI</w:t>
+        <w:t>Software Engineer — SAP CPQ / Lead-to-Cash · Backend, Full-Stack &amp; Applied AI</w:t>
       </w:r>
     </w:p>
     <w:p>
@@ -60,12 +60,13 @@
     <w:p>
       <w:pPr>
         <w:spacing w:after="60" w:before="0"/>
+        <w:jc w:val="both"/>
       </w:pPr>
       <w:r>
         <w:rPr>
           <w:sz w:val="19"/>
         </w:rPr>
-        <w:t>Software engineer with 3+ years across backend, full-stack, and applied AI — currently on SAP's Lead-to-Cash platform at TCS. Blend of enterprise delivery and builder's range: I ship production systems, run oriz.in (a family of free web tools + open-source MCP servers), and turn AI into tools that cut real work — with a JEE Advanced AIR 11870 (top 1%) pedigree. Vision: build AI-native products that make powerful tools free and effortless for everyone — the way oriz.in already does at small scale.</w:t>
+        <w:t>Software engineer with 3+ years across backend, full-stack, and applied AI, currently on SAP’s Lead-to-Cash (CPQ) platform at Tata Consultancy Services, where I keep enterprise quoting systems running and build AI tooling that speeds real work. Alongside my day job I design and ship oriz.in — a self-run family of free, privacy-first web tools, live-data APIs, and open-source Model Context Protocol (MCP) servers used by AI agents — which keeps me fluent end-to-end, from backend architecture and data pipelines to frontend, DevOps, and the AI layer that ties it together. A JEE Advanced 2020 All India Rank 11870 (top 1%) and college topper, I move fast on hard problems and care about shipping. My vision is to build AI-native products that make powerful tools free and effortless for everyone — the way oriz.in already does at small scale.</w:t>
       </w:r>
     </w:p>
     <w:p>
@@ -93,7 +94,7 @@
           <w:i/>
           <w:sz w:val="19"/>
         </w:rPr>
-        <w:t>3+ years shipping backend, full-stack, and applied-AI systems — from enterprise SAP CPQ at TCS to a self-run family of production web tools.</w:t>
+        <w:t>3+ years shipping backend, full-stack, and applied-AI systems — from enterprise SAP CPQ at TCS to a self-run family of production web tools and open-source libraries.</w:t>
       </w:r>
     </w:p>
     <w:p>
@@ -129,7 +130,7 @@
         <w:rPr>
           <w:sz w:val="19"/>
         </w:rPr>
-        <w:t>Support SAP CPQ Lead-to-Cash across 20+ areas (Bill of Materials &amp; Pricing, Quote Terms, Deal Reviews, Provisioning, Contracting, OBV).</w:t>
+        <w:t>Support the SAP CPQ (Configure-Price-Quote) Lead-to-Cash platform across 20+ functional areas — Bill of Materials &amp; Pricing, Opportunity Management, Quote Info &amp; Terms, Deal Reviews &amp; Approvals, Provisioning, Contracting, OBV, and Public Cloud Order Management.</w:t>
       </w:r>
     </w:p>
     <w:p>
@@ -142,7 +143,7 @@
         <w:rPr>
           <w:sz w:val="19"/>
         </w:rPr>
-        <w:t>Built a hybrid-RAG search over the onboarding knowledge base (100+ videos, 40+ decks) that cuts ticket-resolution time.</w:t>
+        <w:t>Built a hybrid-RAG search and documentation system over the CPQ onboarding knowledge base (100+ videos, 40+ decks) — dense embeddings + BM25 + reranking on SAP-approved Hyperspace AI — that cuts ticket-resolution and onboarding time; currently completing the Cloud Quote KT.</w:t>
       </w:r>
     </w:p>
     <w:p>
@@ -155,7 +156,20 @@
         <w:rPr>
           <w:sz w:val="19"/>
         </w:rPr>
-        <w:t>Automate pricing/config validation and CI/CD in Python; build React dashboards for config visibility.</w:t>
+        <w:t>Automate pricing and configuration validation, testing, and CI/CD workflows in Python; build React dashboards giving real-time visibility into backend configuration state.</w:t>
+      </w:r>
+    </w:p>
+    <w:p>
+      <w:pPr>
+        <w:pStyle w:val="ListBullet"/>
+        <w:spacing w:after="40"/>
+        <w:ind w:left="288"/>
+      </w:pPr>
+      <w:r>
+        <w:rPr>
+          <w:sz w:val="19"/>
+        </w:rPr>
+        <w:t>Diagnose and resolve configuration, pricing, and quote-lifecycle issues across a large enterprise codebase in an Agile team.</w:t>
       </w:r>
     </w:p>
     <w:p>
@@ -170,7 +184,7 @@
           <w:b/>
           <w:sz w:val="20"/>
         </w:rPr>
-        <w:t>Full-Stack Developer — QRsay.com</w:t>
+        <w:t>Software Developer — Full Stack — QRsay.com</w:t>
       </w:r>
       <w:r>
         <w:rPr>
@@ -191,7 +205,7 @@
         <w:rPr>
           <w:sz w:val="19"/>
         </w:rPr>
-        <w:t>Built a food-commerce platform (Python / Node.js / MongoDB) with a Kafka order pipeline and Razorpay payments.</w:t>
+        <w:t>Built and maintained a high-traffic food-commerce platform end to end with Python, Node.js, and MongoDB.</w:t>
       </w:r>
     </w:p>
     <w:p>
@@ -204,7 +218,33 @@
         <w:rPr>
           <w:sz w:val="19"/>
         </w:rPr>
-        <w:t>Cut API latency through query tuning and Redis caching.</w:t>
+        <w:t>Designed an event-driven order-processing pipeline on Apache Kafka to synchronise orders across distributed outlets without data loss under peak load.</w:t>
+      </w:r>
+    </w:p>
+    <w:p>
+      <w:pPr>
+        <w:pStyle w:val="ListBullet"/>
+        <w:spacing w:after="40"/>
+        <w:ind w:left="288"/>
+      </w:pPr>
+      <w:r>
+        <w:rPr>
+          <w:sz w:val="19"/>
+        </w:rPr>
+        <w:t>Integrated a Razorpay payment gateway with HMAC-verified webhooks and secure authentication flows.</w:t>
+      </w:r>
+    </w:p>
+    <w:p>
+      <w:pPr>
+        <w:pStyle w:val="ListBullet"/>
+        <w:spacing w:after="40"/>
+        <w:ind w:left="288"/>
+      </w:pPr>
+      <w:r>
+        <w:rPr>
+          <w:sz w:val="19"/>
+        </w:rPr>
+        <w:t>Cut API response times through query optimisation, indexing, and Redis caching; built modular React frontend components.</w:t>
       </w:r>
     </w:p>
     <w:p>
@@ -220,7 +260,32 @@
           <w:color w:val="14532D"/>
           <w:sz w:val="22"/>
         </w:rPr>
-        <w:t>PROJECTS</w:t>
+        <w:t>OPEN-SOURCE PROJECTS &amp; PRODUCTS</w:t>
+      </w:r>
+    </w:p>
+    <w:p>
+      <w:pPr>
+        <w:spacing w:after="0" w:before="0"/>
+      </w:pPr>
+      <w:r>
+        <w:rPr>
+          <w:b/>
+          <w:sz w:val="20"/>
+        </w:rPr>
+        <w:t>oriz.in</w:t>
+      </w:r>
+      <w:r>
+        <w:rPr>
+          <w:sz w:val="18"/>
+        </w:rPr>
+        <w:t xml:space="preserve">  ·  flagship · Astro · React · TypeScript · Cloudflare   </w:t>
+      </w:r>
+      <w:r>
+        <w:rPr>
+          <w:color w:val="14532D"/>
+          <w:sz w:val="18"/>
+        </w:rPr>
+        <w:t>oriz.in</w:t>
       </w:r>
     </w:p>
     <w:p>
@@ -233,7 +298,32 @@
         <w:rPr>
           <w:sz w:val="19"/>
         </w:rPr>
-        <w:t>oriz.in — free client-side web tools &amp; live-data APIs; runs in-browser / on Cloudflare Workers. Publishes @chirag127/* npm packages.</w:t>
+        <w:t>A growing family of free, privacy-first, client-side web tools and live-data APIs; all compute runs in-browser or on Cloudflare Workers — no server needed for end users. Publishes reusable @chirag127/* npm packages (design-system atoms, keyless multi-provider LLM client).</w:t>
+      </w:r>
+    </w:p>
+    <w:p>
+      <w:pPr>
+        <w:spacing w:after="0" w:before="0"/>
+      </w:pPr>
+      <w:r>
+        <w:rPr>
+          <w:b/>
+          <w:sz w:val="20"/>
+        </w:rPr>
+        <w:t>Clear-Thought MCP Server</w:t>
+      </w:r>
+      <w:r>
+        <w:rPr>
+          <w:sz w:val="18"/>
+        </w:rPr>
+        <w:t xml:space="preserve">  ·  36 stars · TypeScript   </w:t>
+      </w:r>
+      <w:r>
+        <w:rPr>
+          <w:color w:val="14532D"/>
+          <w:sz w:val="18"/>
+        </w:rPr>
+        <w:t>chirag127/Clear-Thought-MCP-server</w:t>
       </w:r>
     </w:p>
     <w:p>
@@ -246,7 +336,32 @@
         <w:rPr>
           <w:sz w:val="19"/>
         </w:rPr>
-        <w:t>Clear-Thought MCP Server (36 stars) — MCP server giving AI agents 16 structured-thinking tools; zero runtime deps.</w:t>
+        <w:t>Model Context Protocol server exposing 16 structured-thinking tools (sequential reasoning, mental-model selection, debugging frameworks); zero runtime deps beyond the MCP SDK.</w:t>
+      </w:r>
+    </w:p>
+    <w:p>
+      <w:pPr>
+        <w:spacing w:after="0" w:before="0"/>
+      </w:pPr>
+      <w:r>
+        <w:rPr>
+          <w:b/>
+          <w:sz w:val="20"/>
+        </w:rPr>
+        <w:t>bookmark-mind</w:t>
+      </w:r>
+      <w:r>
+        <w:rPr>
+          <w:sz w:val="18"/>
+        </w:rPr>
+        <w:t xml:space="preserve">  ·  10 stars · JavaScript   </w:t>
+      </w:r>
+      <w:r>
+        <w:rPr>
+          <w:color w:val="14532D"/>
+          <w:sz w:val="18"/>
+        </w:rPr>
+        <w:t>chirag127/bookmark-mind</w:t>
       </w:r>
     </w:p>
     <w:p>
@@ -259,7 +374,58 @@
         <w:rPr>
           <w:sz w:val="19"/>
         </w:rPr>
-        <w:t>bookmark-mind (10 stars) — Chrome extension that auto-sorts bookmarks with a local LLM, no cloud round-trip.</w:t>
+        <w:t>Chrome extension that auto-categorises bookmarks using a local LLM call — no cloud round-trip — with a polished popup UI and one-click reorganise.</w:t>
+      </w:r>
+    </w:p>
+    <w:p>
+      <w:pPr>
+        <w:spacing w:after="0" w:before="0"/>
+      </w:pPr>
+      <w:r>
+        <w:rPr>
+          <w:b/>
+          <w:sz w:val="20"/>
+        </w:rPr>
+        <w:t>OmniDistribute</w:t>
+      </w:r>
+      <w:r>
+        <w:rPr>
+          <w:sz w:val="18"/>
+        </w:rPr>
+        <w:t xml:space="preserve">  ·  TypeScript   </w:t>
+      </w:r>
+      <w:r>
+        <w:rPr>
+          <w:color w:val="14532D"/>
+          <w:sz w:val="18"/>
+        </w:rPr>
+        <w:t>chirag127/OmniDistribute</w:t>
+      </w:r>
+    </w:p>
+    <w:p>
+      <w:pPr>
+        <w:pStyle w:val="ListBullet"/>
+        <w:spacing w:after="40"/>
+        <w:ind w:left="288"/>
+      </w:pPr>
+      <w:r>
+        <w:rPr>
+          <w:sz w:val="19"/>
+        </w:rPr>
+        <w:t>Resilient, idempotent content-distribution engine publishing a single Markdown source to 30+ platforms; adapter pattern with circuit-breaker + retry.</w:t>
+      </w:r>
+    </w:p>
+    <w:p>
+      <w:pPr>
+        <w:pStyle w:val="ListBullet"/>
+        <w:spacing w:after="40"/>
+        <w:ind w:left="288"/>
+      </w:pPr>
+      <w:r>
+        <w:rPr>
+          <w:sz w:val="19"/>
+        </w:rPr>
+        <w:t>Also: Stochastic-Thinking MCP Server · YouTube AI Navigator · olivia (offline voice assistant) · sponsorblock-ai — github.com/chirag127</w:t>
       </w:r>
     </w:p>
     <w:p>
@@ -287,13 +453,31 @@
           <w:b/>
           <w:sz w:val="19"/>
         </w:rPr>
-        <w:t xml:space="preserve">Backend &amp; AI: </w:t>
+        <w:t xml:space="preserve">Languages: </w:t>
       </w:r>
       <w:r>
         <w:rPr>
           <w:sz w:val="19"/>
         </w:rPr>
-        <w:t>Python, Node.js, FastAPI, REST APIs, MCP servers, RAG, multi-provider LLMs (Gemini/Groq/Mistral)</w:t>
+        <w:t>Python (advanced), TypeScript, JavaScript, SQL, Bash</w:t>
+      </w:r>
+    </w:p>
+    <w:p>
+      <w:pPr>
+        <w:spacing w:after="20" w:before="0"/>
+      </w:pPr>
+      <w:r>
+        <w:rPr>
+          <w:b/>
+          <w:sz w:val="19"/>
+        </w:rPr>
+        <w:t xml:space="preserve">Backend: </w:t>
+      </w:r>
+      <w:r>
+        <w:rPr>
+          <w:sz w:val="19"/>
+        </w:rPr>
+        <w:t>Node.js, FastAPI, Flask, Express.js, REST APIs, microservices, event-driven architecture (Apache Kafka), OAuth2</w:t>
       </w:r>
     </w:p>
     <w:p>
@@ -311,7 +495,7 @@
         <w:rPr>
           <w:sz w:val="19"/>
         </w:rPr>
-        <w:t>TypeScript, React, Astro, Tailwind CSS</w:t>
+        <w:t>React, Astro, Tailwind CSS, HTML5/CSS3, PWAs, browser extensions (Chrome/Firefox)</w:t>
       </w:r>
     </w:p>
     <w:p>
@@ -323,13 +507,85 @@
           <w:b/>
           <w:sz w:val="19"/>
         </w:rPr>
-        <w:t xml:space="preserve">Data &amp; Infra: </w:t>
+        <w:t xml:space="preserve">AI / LLM: </w:t>
       </w:r>
       <w:r>
         <w:rPr>
           <w:sz w:val="19"/>
         </w:rPr>
-        <w:t>PostgreSQL, Redis, MongoDB, Cloudflare Workers, Docker, GitHub Actions CI/CD</w:t>
+        <w:t>MCP server development, RAG pipelines (dense embeddings + BM25 + reranking), multi-provider LLM integration (Gemini, Groq, Mistral, NVIDIA NIM, Cohere), prompt engineering, web scraping (Playwright / httpx / BeautifulSoup)</w:t>
+      </w:r>
+    </w:p>
+    <w:p>
+      <w:pPr>
+        <w:spacing w:after="20" w:before="0"/>
+      </w:pPr>
+      <w:r>
+        <w:rPr>
+          <w:b/>
+          <w:sz w:val="19"/>
+        </w:rPr>
+        <w:t xml:space="preserve">Databases &amp; Storage: </w:t>
+      </w:r>
+      <w:r>
+        <w:rPr>
+          <w:sz w:val="19"/>
+        </w:rPr>
+        <w:t>PostgreSQL (Neon / Supabase), Turso (SQLite edge), Redis / Upstash, MongoDB</w:t>
+      </w:r>
+    </w:p>
+    <w:p>
+      <w:pPr>
+        <w:spacing w:after="20" w:before="0"/>
+      </w:pPr>
+      <w:r>
+        <w:rPr>
+          <w:b/>
+          <w:sz w:val="19"/>
+        </w:rPr>
+        <w:t xml:space="preserve">Cloud &amp; DevOps: </w:t>
+      </w:r>
+      <w:r>
+        <w:rPr>
+          <w:sz w:val="19"/>
+        </w:rPr>
+        <w:t>Cloudflare Workers &amp; Pages, Firebase, Docker, GitHub Actions CI/CD, Wrangler, Linux, cron pipelines</w:t>
+      </w:r>
+    </w:p>
+    <w:p>
+      <w:pPr>
+        <w:spacing w:after="20" w:before="0"/>
+      </w:pPr>
+      <w:r>
+        <w:rPr>
+          <w:b/>
+          <w:sz w:val="19"/>
+        </w:rPr>
+        <w:t xml:space="preserve">Payments &amp; Integrations: </w:t>
+      </w:r>
+      <w:r>
+        <w:rPr>
+          <w:sz w:val="19"/>
+        </w:rPr>
+        <w:t>Razorpay (orders, webhooks, HMAC), Clerk auth, sops + age secrets</w:t>
+      </w:r>
+    </w:p>
+    <w:p>
+      <w:pPr>
+        <w:spacing w:after="20" w:before="0"/>
+      </w:pPr>
+      <w:r>
+        <w:rPr>
+          <w:b/>
+          <w:sz w:val="19"/>
+        </w:rPr>
+        <w:t xml:space="preserve">Practices: </w:t>
+      </w:r>
+      <w:r>
+        <w:rPr>
+          <w:sz w:val="19"/>
+        </w:rPr>
+        <w:t>System design (HLD/LLD), OOP &amp; SOLID, TDD, unit + integration testing, Agile, Git</w:t>
       </w:r>
     </w:p>
     <w:p>
@@ -381,7 +637,7 @@
         <w:rPr>
           <w:sz w:val="19"/>
         </w:rPr>
-        <w:t>College Topper (Rank 1) · Senior Secondary (CBSE) — 97%.</w:t>
+        <w:t>College Topper (Rank 1).</w:t>
       </w:r>
     </w:p>
     <w:p>
@@ -394,7 +650,19 @@
         <w:rPr>
           <w:sz w:val="19"/>
         </w:rPr>
-        <w:t>JEE Advanced 2020 — All India Rank 11870 (top 1%).</w:t>
+        <w:t>Senior Secondary (CBSE) — 97%.</w:t>
+      </w:r>
+    </w:p>
+    <w:p>
+      <w:pPr>
+        <w:spacing w:after="20" w:before="0"/>
+      </w:pPr>
+      <w:r>
+        <w:rPr>
+          <w:b/>
+          <w:sz w:val="19"/>
+        </w:rPr>
+        <w:t>Honors &amp; certifications:</w:t>
       </w:r>
     </w:p>
     <w:p>
@@ -407,12 +675,38 @@
         <w:rPr>
           <w:sz w:val="19"/>
         </w:rPr>
-        <w:t>Claude Certified Associate — Foundations, Anthropic (2026) · 20+ Udemy Business courses (TCS: AI/LLM, Python, MLOps).</w:t>
+        <w:t>JEE Advanced 2020 — All India Rank 11870 (top 1%, ~1M+ aspirants).</w:t>
+      </w:r>
+    </w:p>
+    <w:p>
+      <w:pPr>
+        <w:pStyle w:val="ListBullet"/>
+        <w:spacing w:after="40"/>
+        <w:ind w:left="288"/>
+      </w:pPr>
+      <w:r>
+        <w:rPr>
+          <w:sz w:val="19"/>
+        </w:rPr>
+        <w:t>Claude Certified Associate — Foundations, Anthropic (2026).</w:t>
+      </w:r>
+    </w:p>
+    <w:p>
+      <w:pPr>
+        <w:pStyle w:val="ListBullet"/>
+        <w:spacing w:after="40"/>
+        <w:ind w:left="288"/>
+      </w:pPr>
+      <w:r>
+        <w:rPr>
+          <w:sz w:val="19"/>
+        </w:rPr>
+        <w:t>20+ Udemy Business courses (via TCS) across AI/LLM (Claude Code, MCP, Generative AI), Machine Learning, Python, EU AI Act compliance, and Agile.</w:t>
       </w:r>
     </w:p>
     <w:sectPr>
       <w:pgSz w:w="12240" w:h="15840"/>
-      <w:pgMar w:top="792" w:right="1008" w:bottom="792" w:left="1008" w:header="720" w:footer="720" w:gutter="0"/>
+      <w:pgMar w:top="864" w:right="1008" w:bottom="864" w:left="1008" w:header="720" w:footer="720" w:gutter="0"/>
       <w:cols w:space="720"/>
       <w:docGrid w:linePitch="360"/>
     </w:sectPr>

</xml_diff>

<commit_message>
fix(resume): correct overstated project claims to match tested reality
- Clear-Thought: 11 tools (was 16), built on MCP SDK (dropped false zero-deps)
- bookmark-mind: OpenAI-compatible BYO-key over 13 providers + custom endpoints (was Gemini/local-only)
- correct repo URL bookmark-mind-bs-ext
</commit_message>
<xml_diff>
--- a/public/resume/chirag-singhal-resume.docx
+++ b/public/resume/chirag-singhal-resume.docx
@@ -336,7 +336,7 @@
         <w:rPr>
           <w:sz w:val="19"/>
         </w:rPr>
-        <w:t>Model Context Protocol server exposing 16 structured-thinking tools (sequential reasoning, mental-model selection, debugging frameworks); zero runtime deps beyond the MCP SDK.</w:t>
+        <w:t>Model Context Protocol server exposing 11 structured-thinking tools (sequential thinking, mental models, decision frameworks, debugging approaches, scientific method, structured argumentation) to MCP-compatible AI clients; a lean, typed toolset built on the MCP SDK.</w:t>
       </w:r>
     </w:p>
     <w:p>
@@ -361,7 +361,7 @@
           <w:color w:val="14532D"/>
           <w:sz w:val="18"/>
         </w:rPr>
-        <w:t>chirag127/bookmark-mind</w:t>
+        <w:t>chirag127/bookmark-mind-bs-ext</w:t>
       </w:r>
     </w:p>
     <w:p>
@@ -374,7 +374,7 @@
         <w:rPr>
           <w:sz w:val="19"/>
         </w:rPr>
-        <w:t>Chrome extension that auto-categorises bookmarks using a local LLM call — no cloud round-trip — with a polished popup UI and one-click reorganise.</w:t>
+        <w:t>Chrome/Firefox extension that auto-categorises bookmarks with an LLM and offers AI chat + multi-model comparison over your saved links. Bring-your-own-key over any OpenAI-compatible endpoint (Groq, OpenRouter, Gemini, Mistral, local LM Studio / Ollama) through one uniform provider adapter; keys stored client-side, plus user-added custom providers.</w:t>
       </w:r>
     </w:p>
     <w:p>

</xml_diff>

<commit_message>
fix(resume): Clear-Thought = 12 tools + 69-test CI, olivia offline via faster-whisper (verified)
</commit_message>
<xml_diff>
--- a/public/resume/chirag-singhal-resume.docx
+++ b/public/resume/chirag-singhal-resume.docx
@@ -336,7 +336,7 @@
         <w:rPr>
           <w:sz w:val="19"/>
         </w:rPr>
-        <w:t>Model Context Protocol server exposing 11 structured-thinking tools (sequential thinking, mental models, decision frameworks, debugging approaches, scientific method, structured argumentation) to MCP-compatible AI clients; a lean, typed toolset built on the MCP SDK.</w:t>
+        <w:t>Model Context Protocol server exposing 12 structured-thinking tools (sequential &amp; stochastic reasoning, mental models, decision frameworks, debugging approaches, scientific method, structured argumentation) to MCP-compatible AI clients; typed toolset on the MCP SDK, covered end-to-end by a 69-test Vitest suite in CI.</w:t>
       </w:r>
     </w:p>
     <w:p>
@@ -425,7 +425,7 @@
         <w:rPr>
           <w:sz w:val="19"/>
         </w:rPr>
-        <w:t>Also: Stochastic-Thinking MCP Server · YouTube AI Navigator · olivia (offline voice assistant) · sponsorblock-ai — github.com/chirag127</w:t>
+        <w:t>Also: Stochastic-Thinking MCP Server · YouTube AI Navigator · olivia (Python voice assistant, fully offline STT via local faster-whisper) · sponsorblock-ai — github.com/chirag127</w:t>
       </w:r>
     </w:p>
     <w:p>

</xml_diff>